<commit_message>
Mavzu raqamlari va havolalarni tuzatish, A12 testini kuchaytirish
- Kod sarlavhalari (A06–A22) fan dasturidagi raqamlarga moslandi
- Qo'llanmalardagi "Ax mavzusiga oid kodlar" havolalari papkalarga moslandi
- Noto'g'ri bog'lanishlar: A03→A21 (ovoz berish), A07→A15 (L1/L2),
  A12→A13 (ERC-20), A22→A21 (DAO); A09 hisobotida 10.2→9.2
- Hisob.sol izohidagi ma'ruza raqami (M8→M7) qo'llanmaga moslandi
- A12 test_mashqlar.py: 15 ta o'rniga 20 ta tekshiruv (har mashqqa 4 ta):
  kamaytir() event'i, soni va Qoshildi event'i, kurs 0, yopilgan ovoz,
  0 ETH rad, qayta olish, qosh() event'i va reentrancy hujumchi kontrakti
- A12 qo'llanmasidagi baholash chegaralari 20 ballik testga moslandi
- Kod zip arxivlari yangilangan fayllar bilan sinxronlandi

Co-Authored-By: Claude Opus 5.5 <noreply@anthropic.com>
Claude-Session: https://claude.ai/code/session_01211J4GhAPU473avPFqaNRY
</commit_message>
<xml_diff>
--- a/A03/A03 - Merkle daraxtini qurish va a’zolik isbotini (Merkle proof) tekshirish.docx
+++ b/A03/A03 - Merkle daraxtini qurish va a’zolik isbotini (Merkle proof) tekshirish.docx
@@ -2791,7 +2791,7 @@
           <w:sz w:val="22"/>
           <w:szCs w:val="22"/>
         </w:rPr>
-        <w:t xml:space="preserve">Endi nazariyadan loyihaga o'tamiz. Guruhingizning hamyon manzillaridan Merkle daraxti quriladi. Uning ildizi (root) A22-mashg'ulotdagi ovoz berish kontraktiga yoziladi — ya'ni bugungi natija uch oydan keyin kerak bo'ladi.</w:t>
+        <w:t>Endi nazariyadan loyihaga o'tamiz. Guruhingizning hamyon manzillaridan Merkle daraxti quriladi. Uning ildizi (root) A21-mashg'ulotdagi ovoz berish kontraktiga yoziladi — ya'ni bugungi natija uch oydan keyin kerak bo'ladi.</w:t>
       </w:r>
     </w:p>
     <w:p>
@@ -3895,7 +3895,7 @@
                 <w:sz w:val="22"/>
                 <w:szCs w:val="22"/>
               </w:rPr>
-              <w:t xml:space="preserve">Bu faylni semestr oxirigacha yo'qotmang. A22-mashg'ulotda ovoz berish uchun aynan shu proof kerak bo'ladi. Zaxira nusxasini elektron pochtangizga yuborib qo'ying.</w:t>
+              <w:t>Bu faylni semestr oxirigacha yo'qotmang. A21-mashg'ulotda ovoz berish uchun aynan shu proof kerak bo'ladi. Zaxira nusxasini elektron pochtangizga yuborib qo'ying.</w:t>
             </w:r>
           </w:p>
         </w:tc>
@@ -6164,7 +6164,7 @@
           <w:sz w:val="22"/>
           <w:szCs w:val="22"/>
         </w:rPr>
-        <w:t xml:space="preserve">Guruh manzillari ro'yxatini umumiy faylga yig'ib, barcha talabalarga bir xil nusxasini tarqating. Agar ro'yxat har kimda boshqacha bo'lsa, root ham boshqa chiqadi va A22 da ovoz berish ishlamaydi.</w:t>
+        <w:t>Guruh manzillari ro'yxatini umumiy faylga yig'ib, barcha talabalarga bir xil nusxasini tarqating. Agar ro'yxat har kimda boshqacha bo'lsa, root ham boshqa chiqadi va A21 da ovoz berish ishlamaydi.</w:t>
       </w:r>
     </w:p>
     <w:p>
@@ -6196,7 +6196,7 @@
           <w:sz w:val="22"/>
           <w:szCs w:val="22"/>
         </w:rPr>
-        <w:t xml:space="preserve">Talabalar proof faylini yo'qotishi ehtimoli yuqori. Barcha proof'larni o'zingiz ham bitta papkada saqlang — bu A22 da vaqtni tejaydi.</w:t>
+        <w:t>Talabalar proof faylini yo'qotishi ehtimoli yuqori. Barcha proof'larni o'zingiz ham bitta papkada saqlang — bu A21 da vaqtni tejaydi.</w:t>
       </w:r>
     </w:p>
     <w:p>

</xml_diff>